<commit_message>
Fix: url in paragraph
</commit_message>
<xml_diff>
--- a/data/inputs/לאסוף את השברים.docx
+++ b/data/inputs/לאסוף את השברים.docx
@@ -1,6 +1,6 @@
 
 <file path=word/document.xml><?xml version="1.0" encoding="utf-8"?>
-<w:document xmlns:ve="http://schemas.openxmlformats.org/markup-compatibility/2006" xmlns:o="urn:schemas-microsoft-com:office:office" xmlns:r="http://schemas.openxmlformats.org/officeDocument/2006/relationships" xmlns:m="http://schemas.openxmlformats.org/officeDocument/2006/math" xmlns:v="urn:schemas-microsoft-com:vml" xmlns:wp="http://schemas.openxmlformats.org/drawingml/2006/wordprocessingDrawing" xmlns:w10="urn:schemas-microsoft-com:office:word" xmlns:w="http://schemas.openxmlformats.org/wordprocessingml/2006/main" xmlns:wne="http://schemas.microsoft.com/office/word/2006/wordml">
+<w:document xmlns:wpc="http://schemas.microsoft.com/office/word/2010/wordprocessingCanvas" xmlns:cx="http://schemas.microsoft.com/office/drawing/2014/chartex" xmlns:cx1="http://schemas.microsoft.com/office/drawing/2015/9/8/chartex" xmlns:cx2="http://schemas.microsoft.com/office/drawing/2015/10/21/chartex" xmlns:cx3="http://schemas.microsoft.com/office/drawing/2016/5/9/chartex" xmlns:cx4="http://schemas.microsoft.com/office/drawing/2016/5/10/chartex" xmlns:cx5="http://schemas.microsoft.com/office/drawing/2016/5/11/chartex" xmlns:cx6="http://schemas.microsoft.com/office/drawing/2016/5/12/chartex" xmlns:cx7="http://schemas.microsoft.com/office/drawing/2016/5/13/chartex" xmlns:cx8="http://schemas.microsoft.com/office/drawing/2016/5/14/chartex" xmlns:mc="http://schemas.openxmlformats.org/markup-compatibility/2006" xmlns:aink="http://schemas.microsoft.com/office/drawing/2016/ink" xmlns:am3d="http://schemas.microsoft.com/office/drawing/2017/model3d" xmlns:o="urn:schemas-microsoft-com:office:office" xmlns:oel="http://schemas.microsoft.com/office/2019/extlst" xmlns:r="http://schemas.openxmlformats.org/officeDocument/2006/relationships" xmlns:m="http://schemas.openxmlformats.org/officeDocument/2006/math" xmlns:v="urn:schemas-microsoft-com:vml" xmlns:wp14="http://schemas.microsoft.com/office/word/2010/wordprocessingDrawing" xmlns:wp="http://schemas.openxmlformats.org/drawingml/2006/wordprocessingDrawing" xmlns:w10="urn:schemas-microsoft-com:office:word" xmlns:w="http://schemas.openxmlformats.org/wordprocessingml/2006/main" xmlns:w14="http://schemas.microsoft.com/office/word/2010/wordml" xmlns:w15="http://schemas.microsoft.com/office/word/2012/wordml" xmlns:w16cex="http://schemas.microsoft.com/office/word/2018/wordml/cex" xmlns:w16cid="http://schemas.microsoft.com/office/word/2016/wordml/cid" xmlns:w16="http://schemas.microsoft.com/office/word/2018/wordml" xmlns:w16du="http://schemas.microsoft.com/office/word/2023/wordml/word16du" xmlns:w16sdtdh="http://schemas.microsoft.com/office/word/2020/wordml/sdtdatahash" xmlns:w16sdtfl="http://schemas.microsoft.com/office/word/2024/wordml/sdtformatlock" xmlns:w16se="http://schemas.microsoft.com/office/word/2015/wordml/symex" xmlns:wpg="http://schemas.microsoft.com/office/word/2010/wordprocessingGroup" xmlns:wpi="http://schemas.microsoft.com/office/word/2010/wordprocessingInk" xmlns:wne="http://schemas.microsoft.com/office/word/2006/wordml" xmlns:wps="http://schemas.microsoft.com/office/word/2010/wordprocessingShape" mc:Ignorable="w14 w15 w16se w16cid w16 w16cex w16sdtdh w16sdtfl w16du wp14">
   <w:body>
     <w:p>
       <w:pPr>
@@ -8,13 +8,13 @@
       </w:pPr>
       <w:r>
         <w:rPr>
+          <w:b/>
+          <w:bCs/>
           <w:sz w:val="50"/>
           <w:szCs w:val="50"/>
-          <w:b w:val="1"/>
-          <w:bCs w:val="1"/>
-          <w:rtl/>
-        </w:rPr>
-        <w:t xml:space="preserve">לאסוף את השברים</w:t>
+          <w:rtl/>
+        </w:rPr>
+        <w:t>לאסוף את השברים</w:t>
       </w:r>
     </w:p>
     <w:p>
@@ -27,7 +27,7 @@
           <w:szCs w:val="36"/>
           <w:rtl/>
         </w:rPr>
-        <w:t xml:space="preserve">עדי שנייד</w:t>
+        <w:t>עדי שנייד</w:t>
       </w:r>
     </w:p>
     <w:p>
@@ -36,11 +36,9 @@
       </w:pPr>
       <w:r>
         <w:rPr>
-          <w:sz w:val="28"/>
-          <w:szCs w:val="28"/>
-          <w:rtl/>
-        </w:rPr>
-        <w:t xml:space="preserve">מקצוע: חינוך</w:t>
+          <w:rtl/>
+        </w:rPr>
+        <w:t>מקצוע: חינוך</w:t>
       </w:r>
     </w:p>
     <w:p>
@@ -49,11 +47,9 @@
       </w:pPr>
       <w:r>
         <w:rPr>
-          <w:sz w:val="28"/>
-          <w:szCs w:val="28"/>
-          <w:rtl/>
-        </w:rPr>
-        <w:t xml:space="preserve">נושא: חודש אלול, חורבן וגאולה, רצון לצמיחה</w:t>
+          <w:rtl/>
+        </w:rPr>
+        <w:t>נושא: חודש אלול, חורבן וגאולה, רצון לצמיחה</w:t>
       </w:r>
     </w:p>
     <w:p>
@@ -62,11 +58,9 @@
       </w:pPr>
       <w:r>
         <w:rPr>
-          <w:sz w:val="28"/>
-          <w:szCs w:val="28"/>
-          <w:rtl/>
-        </w:rPr>
-        <w:t xml:space="preserve">כיתה: חטיבה, תיכון</w:t>
+          <w:rtl/>
+        </w:rPr>
+        <w:t>כיתה: חטיבה, תיכון</w:t>
       </w:r>
     </w:p>
     <w:p>
@@ -75,23 +69,17 @@
       </w:pPr>
       <w:r>
         <w:rPr>
-          <w:sz w:val="28"/>
-          <w:szCs w:val="28"/>
-          <w:rtl/>
-        </w:rPr>
-        <w:t xml:space="preserve">יצירה</w:t>
+          <w:rtl/>
+        </w:rPr>
+        <w:t>יצירה</w:t>
       </w:r>
     </w:p>
     <w:p>
       <w:pPr>
         <w:pBdr>
-          <w:bottom w:val="single" w:sz="2"/>
+          <w:bottom w:val="single" w:sz="2" w:space="0" w:color="auto"/>
         </w:pBdr>
       </w:pPr>
-      <w:r>
-        <w:rPr/>
-        <w:t xml:space="preserve"/>
-      </w:r>
     </w:p>
     <w:p>
       <w:pPr>
@@ -101,19 +89,15 @@
         <w:rPr>
           <w:rtl/>
         </w:rPr>
-        <w:t xml:space="preserve">חודש אלול תשפ"ד טומן בחובו גם את סיומה של שנת מלחמה (אף על פי שהיא עצמה עדיין נמשכת) וגם את פתיחת שנת הלימודים. זו הזדמנות עבורנו לעשות סיכום של שברי השנה האחרונה יחד עם הכוחות שפיתחנו ועמדו לזכותנו.</w:t>
+        <w:t>חודש אלול תשפ"ד טומן בחובו גם את סיומה של שנת מלחמה (אף על פי שהיא עצמה עדיין נמשכת) וגם את פתיחת שנת הלימודים. זו הזדמנות עבורנו לעשות סיכום של שברי השנה האחרונה יחד עם הכוחות שפיתחנו ועמדו לזכותנו.</w:t>
       </w:r>
     </w:p>
     <w:p>
       <w:pPr>
         <w:pBdr>
-          <w:bottom w:val="single" w:sz="2"/>
+          <w:bottom w:val="single" w:sz="2" w:space="0" w:color="auto"/>
         </w:pBdr>
       </w:pPr>
-      <w:r>
-        <w:rPr/>
-        <w:t xml:space="preserve"/>
-      </w:r>
     </w:p>
     <w:p>
       <w:pPr>
@@ -121,10 +105,10 @@
       </w:pPr>
       <w:r>
         <w:rPr>
+          <w:b/>
+          <w:bCs/>
           <w:sz w:val="50"/>
           <w:szCs w:val="50"/>
-          <w:b w:val="1"/>
-          <w:bCs w:val="1"/>
           <w:rtl/>
         </w:rPr>
         <w:t xml:space="preserve">פתיחה: שיר הקינצוגי: </w:t>
@@ -138,40 +122,14 @@
         <w:rPr>
           <w:rtl/>
         </w:rPr>
-        <w:t xml:space="preserve">נפתח את השיעור בשיר שמספר על שיטת אומנות יפנית ייחודית בשם קינצוגי. בנוסף לשיר נראה גם תמונה, או כמה תמונות, של כלים שנעשו בשיטה זו.
-לַיָּפָּנִים יֵשׁ קֶטַע מוּזָר
-בִּמְקוֹם לִזְרֹק קְעָרָה שֶׁנִּשְׁבְּרָה
-הֵם אוֹסְפִים אֶת כָּל הַחֲתִיכוֹת שֶׁלָּהּ
-וּמַרְכִּיבִים אוֹתָהּ לְאַט בַּחֲזָרָה
-כְּאִלּוּ הֵם לֹא מוּכָנִים לְוַתֵּר
-גַּם לְמַשֶּׁהוּ שֶׁהוּא הָרוּס וְשָׁבוּר
-אָז הֵם לוֹקְחִים אֶת הַמַּצָּב הַסּוֹפִי הַזֶּה
-וְהוֹפְכִים אוֹתוֹ לְהַתְחָלָה שֶׁל סִפּוּר
-וְזֶה תַּהֲלִיךְ לֹא פָּשׁוּט
-הוּא דּוֹרֵשׁ זְמַן וַעֲדִינוּת
-אֲבָל מַה שֶׁבֶּאֱמֶת מְטֹרָף
-זֶה שֶׁהֵם לֹא מִשְׁתַּמְּשִׁים
-סְתָם בְּדֶבֶק שָׁקוּף
-הֵם מִדְבִּיקִים הַכֹּל יַחַד בְּזָהָב
-כְּאִלּוּ הֵם מִתְעַקְּשִׁים
-לָקַחַת אֶת הַסְּדָקִים
-הַקְּטַנִּים הָאֵלֶּה, הַבִּלְתִּי נִרְאִים
-וּלְהַצִּיג אוֹתָם כָּכָה
-בְּגַאֲוָה לָעוֹלָם
-כַּדָּבָר הֲכִי נוֹצֵץ, הֲכִי מִדְהִים
-וּמִכֵּיוָן שֶׁכָּל קְעָרָה שֶׁנִּשְׁבֶּרֶת
-יוֹצֶרֶת חֲלָקִים כָּל כָּךְ שׁוֹנִים
-אָז כָּל אַחַת שֶׁמַּדְבִּיקִים נִרְאֵית אַחֶרֶת
-וְזֶה כְּאִלּוּ הִיא אוֹמֶרֶת לִפְעָמִים:
-אֵלּוּ הַשְּׂרִיטוֹת שֶׁלִּי
-אֵלּוּ הַשְּׁבָרִים שֶׁלִּי
-אֲנִי לֹא דּוֹמָה לְשׁוּם דָּבָר קַיָּם
-בּוֹאוּ וְתִרְאוּ
-כַּמָּה יָפָה אֲנִי
-אֵין עוֹד אַף אַחַת כָּמוֹנִי בָּעוֹלָם
-(ברק פלדמן)
-מה אתם חושבים על התפיסה היפנית?
-האם באמת יש יכולת לתקן שברים בצורה טובה?</w:t>
+        <w:t xml:space="preserve">נפתח את השיעור בשיר שמספר על שיטת אומנות יפנית ייחודית בשם קינצוגי. בנוסף לשיר נראה גם תמונה, או כמה תמונות, של כלים שנעשו בשיטה זו. לַיָּפָּנִים יֵשׁ קֶטַע מוּזָר בִּמְקוֹם לִזְרֹק קְעָרָה שֶׁנִּשְׁבְּרָה הֵם אוֹסְפִים אֶת כָּל הַחֲתִיכוֹת שֶׁלָּהּ וּמַרְכִּיבִים אוֹתָהּ לְאַט בַּחֲזָרָה   כְּאִלּוּ הֵם לֹא מוּכָנִים לְוַתֵּר גַּם לְמַשֶּׁהוּ שֶׁהוּא הָרוּס וְשָׁבוּר אָז הֵם לוֹקְחִים אֶת הַמַּצָּב הַסּוֹפִי הַזֶּה וְהוֹפְכִים אוֹתוֹ לְהַתְחָלָה שֶׁל סִפּוּר   וְזֶה תַּהֲלִיךְ לֹא פָּשׁוּט הוּא דּוֹרֵשׁ זְמַן וַעֲדִינוּת אֲבָל מַה שֶׁבֶּאֱמֶת מְטֹרָף זֶה שֶׁהֵם לֹא מִשְׁתַּמְּשִׁים סְתָם בְּדֶבֶק שָׁקוּף הֵם מִדְבִּיקִים הַכֹּל יַחַד בְּזָהָב   כְּאִלּוּ הֵם מִתְעַקְּשִׁים לָקַחַת אֶת הַסְּדָקִים הַקְּטַנִּים הָאֵלֶּה, הַבִּלְתִּי נִרְאִים וּלְהַצִּיג אוֹתָם כָּכָה בְּגַאֲוָה לָעוֹלָם כַּדָּבָר הֲכִי נוֹצֵץ, הֲכִי מִדְהִים   וּמִכֵּיוָן שֶׁכָּל קְעָרָה שֶׁנִּשְׁבֶּרֶת יוֹצֶרֶת חֲלָקִים כָּל כָּךְ שׁוֹנִים אָז כָּל אַחַת שֶׁמַּדְבִּיקִים נִרְאֵית אַחֶרֶת וְזֶה כְּאִלּוּ הִיא אוֹמֶרֶת לִפְעָמִים:   אֵלּוּ הַשְּׂרִיטוֹת שֶׁלִּי אֵלּוּ הַשְּׁבָרִים שֶׁלִּי אֲנִי לֹא דּוֹמָה </w:t>
+      </w:r>
+      <w:r>
+        <w:rPr>
+          <w:rtl/>
+        </w:rPr>
+        <w:lastRenderedPageBreak/>
+        <w:t>לְשׁוּם דָּבָר קַיָּם בּוֹאוּ וְתִרְאוּ כַּמָּה יָפָה אֲנִי אֵין עוֹד אַף אַחַת כָּמוֹנִי בָּעוֹלָם (ברק פלדמן)    מה אתם חושבים על התפיסה היפנית? האם באמת יש יכולת לתקן שברים בצורה טובה?</w:t>
       </w:r>
     </w:p>
     <w:p>
@@ -180,13 +138,13 @@
       </w:pPr>
       <w:r>
         <w:rPr>
+          <w:b/>
+          <w:bCs/>
           <w:sz w:val="50"/>
           <w:szCs w:val="50"/>
-          <w:b w:val="1"/>
-          <w:bCs w:val="1"/>
-          <w:rtl/>
-        </w:rPr>
-        <w:t xml:space="preserve">מפגש: סיפור חסידי</w:t>
+          <w:rtl/>
+        </w:rPr>
+        <w:t>מפגש: סיפור חסידי</w:t>
       </w:r>
     </w:p>
     <w:p>
@@ -197,16 +155,7 @@
         <w:rPr>
           <w:rtl/>
         </w:rPr>
-        <w:t xml:space="preserve">אחרי שפתחנו בהשקפה היפנית על שבר ותיקון ננסה לפגוש זאת גם מהזווית היהודית.
-“חסיד אחד שאל את רבי אברהם מסטרטין: אנו אומרים בתפילת ראש השנה שהאדם “משול כחרס הנשבר” וידועה ההלכה שאומרת שכלי חרס אין לו טהרה בטבילה ואין לו תקנה אלא שבירה.
-כיוון שכך, כיצד מועילה טבילה במקווה לטהרת אדם?
-השיבו רבי אברהם: אכן, כדבריך, בטבילה עצמה לא די.
-הטבילה מטהרת בזכות התשובה ובזכות הלב הנשבר המתלווים אליה, וכפי שאתה בעצמך אמרת: “כלי חרס- שבירתו זוהי תקנתו”
-מה הכוונה שאצל האדם “שבירתו זו תקנתו”?
-אילו שברים יש באדם?
-איך יכולה להיות תקנה בעצם השבר?
-כל אירוע שמתרחש על האדם במהלך חייו משפיע עליו ומעצב אותו ואת כוחותיו.
-לצערנו, בדרך כלל, כאשר קורים אירועים קשים הם יוצרים אצל האדם תחושות קשות. בשנה זו, שנה של מלחמה, עלולים להיווצר הרבה שברים בנפשו של אדם- פחד, חרדה, עצב, כעס, חוסר אמונה, ייאוש וכד’… בהמשך המפגש נרצה לחשוב יחד אילו כוחות יכולים להיוולד דווקא בזמנים כאלה. אבל קודם נחוש קצת את הדברים “דרך הידיים”</w:t>
+        <w:t>אחרי שפתחנו בהשקפה היפנית על שבר ותיקון ננסה לפגוש זאת גם מהזווית היהודית. “חסיד אחד שאל את רבי אברהם מסטרטין: אנו אומרים בתפילת ראש השנה שהאדם “משול כחרס הנשבר” וידועה ההלכה שאומרת שכלי חרס אין לו טהרה בטבילה ואין לו תקנה אלא שבירה. כיוון שכך, כיצד מועילה טבילה במקווה לטהרת אדם? השיבו רבי אברהם: אכן, כדבריך, בטבילה עצמה לא די. הטבילה מטהרת בזכות התשובה ובזכות הלב הנשבר המתלווים אליה, וכפי שאתה בעצמך אמרת: “כלי חרס- שבירתו זוהי תקנתו”  מה הכוונה שאצל האדם “שבירתו זו תקנתו”? אילו שברים יש באדם? איך יכולה להיות תקנה בעצם השבר?  כל אירוע שמתרחש על האדם במהלך חייו משפיע עליו ומעצב אותו ואת כוחותיו. לצערנו, בדרך כלל, כאשר קורים אירועים קשים הם יוצרים אצל האדם תחושות קשות. בשנה זו, שנה של מלחמה, עלולים להיווצר הרבה שברים בנפשו של אדם- פחד, חרדה, עצב, כעס, חוסר אמונה, ייאוש וכד’… בהמשך המפגש נרצה לחשוב יחד אילו כוחות יכולים להיוולד דווקא בזמנים כאלה. אבל קודם נחוש קצת את הדברים “דרך הידיים”</w:t>
       </w:r>
     </w:p>
     <w:p>
@@ -215,13 +164,13 @@
       </w:pPr>
       <w:r>
         <w:rPr>
+          <w:b/>
+          <w:bCs/>
           <w:sz w:val="50"/>
           <w:szCs w:val="50"/>
-          <w:b w:val="1"/>
-          <w:bCs w:val="1"/>
-          <w:rtl/>
-        </w:rPr>
-        <w:t xml:space="preserve">התבוננות: פעילות יצירה</w:t>
+          <w:rtl/>
+        </w:rPr>
+        <w:t>התבוננות: פעילות יצירה</w:t>
       </w:r>
     </w:p>
     <w:p>
@@ -234,7 +183,7 @@
           <w:szCs w:val="40"/>
           <w:rtl/>
         </w:rPr>
-        <w:t xml:space="preserve">א: אפשרות א</w:t>
+        <w:t>א: אפשרות א</w:t>
       </w:r>
     </w:p>
     <w:p>
@@ -245,15 +194,14 @@
         <w:rPr>
           <w:rtl/>
         </w:rPr>
-        <w:t xml:space="preserve">נחלק לכל תלמיד כלי חרס קטן
-נכניס את הכלי לשקית בד ונשבור את הכלי- שימו לב שהמטרה היא לא לנפץ את הכלי לרסיסים אלא לשבור ככה שנוצרים כמה חלקים גדולים יחסית.
-נוציא את הכלי מהשקית וננסה למקם כל חלק במקומו.
-בשלב זה ניתן לבקש מהתלמידים לכתוב על שברי הכלי דברים שנשברו אצלם השנה.
-נערבב בקערית כמות זהה של דבק אפוקסי ואבקת זהב- מומלץ לעבוד בכמויות קטנות ולהוסיף בעת הצורך כי יש לדבק האפוקסי נטייה להתייבש.
-נחבר את חלקי הכלי בעזרת משחת הזהב.
-נניח בצד להתייבשות מלאה.
-במידה וצבע הזהב יצא עבה או רחב מדי אפשר לשייף עם נייר לטש את חיבורי הזהב לאחר ההתייבשות.
- </w:t>
+        <w:t xml:space="preserve">נחלק לכל תלמיד כלי חרס קטן נכניס את הכלי לשקית בד ונשבור את הכלי- שימו לב שהמטרה היא לא לנפץ את הכלי לרסיסים אלא לשבור ככה שנוצרים כמה חלקים גדולים יחסית. נוציא את הכלי מהשקית וננסה למקם כל חלק במקומו.  בשלב זה ניתן לבקש מהתלמידים לכתוב על שברי הכלי דברים שנשברו אצלם השנה.  נערבב בקערית כמות זהה של דבק אפוקסי ואבקת זהב- מומלץ לעבוד בכמויות קטנות </w:t>
+      </w:r>
+      <w:r>
+        <w:rPr>
+          <w:rtl/>
+        </w:rPr>
+        <w:lastRenderedPageBreak/>
+        <w:t>ולהוסיף בעת הצורך כי יש לדבק האפוקסי נטייה להתייבש. נחבר את חלקי הכלי בעזרת משחת הזהב. נניח בצד להתייבשות מלאה. במידה וצבע הזהב יצא עבה או רחב מדי אפשר לשייף עם נייר לטש את חיבורי הזהב לאחר ההתייבשות.  </w:t>
       </w:r>
     </w:p>
     <w:p>
@@ -266,7 +214,7 @@
           <w:szCs w:val="40"/>
           <w:rtl/>
         </w:rPr>
-        <w:t xml:space="preserve">ב: אפשרות ב</w:t>
+        <w:t>ב: אפשרות ב</w:t>
       </w:r>
     </w:p>
     <w:p>
@@ -277,13 +225,7 @@
         <w:rPr>
           <w:rtl/>
         </w:rPr>
-        <w:t xml:space="preserve">למורים שאין ביכולתם להביא כלי חרס לכתה אפשר לייצר פעילות אומנותית עם רעיון דומה מחומרים מתכלים-
-נפזר בכתה עיתונים ומגזינים שונים.
-נחלק לכל תלמיד בריסטול קשיח או קרטון ביצוע עליו יכין את היצירה שלו.
-נבקש מכל תלמיד לבחור עמוד אחד בלבד שיש בו משהו-  מילים, רעיון, תמונה או סמל שמהווים עבורו את השבר האישי או הלאומי בשנה האחרונה.
-מאותו עמוד נבחר (אם מדובר על עמודי מגזינים קטנים ניתן לאפשר להשתמש ב-2) נבקש ל”צייר” משהו שהם גילו בתוכם או בתוך עמנו בשנה הזו, והוא נותן להם כח ותקווה.
-טיפ- רצוי לסרטט את קווי המיתאר של הציור הרצוי בעפרון ורק לאחר מכן להתחיל להדביק את גזרי העיתונים.
-לדוגמאות מיצירות גזרי עיתון אפשר להכנס לקישור הבא- https://katzr.net/7e8911</w:t>
+        <w:t>למורים שאין ביכולתם להביא כלי חרס לכתה אפשר לייצר פעילות אומנותית עם רעיון דומה מחומרים מתכלים- נפזר בכתה עיתונים ומגזינים שונים. נחלק לכל תלמיד בריסטול קשיח או קרטון ביצוע עליו יכין את היצירה שלו. נבקש מכל תלמיד לבחור עמוד אחד בלבד שיש בו משהו-  מילים, רעיון, תמונה או סמל שמהווים עבורו את השבר האישי או הלאומי בשנה האחרונה. מאותו עמוד נבחר (אם מדובר על עמודי מגזינים קטנים ניתן לאפשר להשתמש ב-2) נבקש ל”צייר” משהו שהם גילו בתוכם או בתוך עמנו בשנה הזו, והוא נותן להם כח ותקווה.  טיפ- רצוי לסרטט את קווי המיתאר של הציור הרצוי בעפרון ורק לאחר מכן להתחיל להדביק את גזרי העיתונים.  לדוגמאות מיצירות גזרי עיתון אפשר להכנס לקישור הבא- https://katzr.net/7e8911</w:t>
       </w:r>
     </w:p>
     <w:p>
@@ -292,10 +234,10 @@
       </w:pPr>
       <w:r>
         <w:rPr>
+          <w:b/>
+          <w:bCs/>
           <w:sz w:val="50"/>
           <w:szCs w:val="50"/>
-          <w:b w:val="1"/>
-          <w:bCs w:val="1"/>
           <w:rtl/>
         </w:rPr>
         <w:t xml:space="preserve">הפנמה: </w:t>
@@ -309,11 +251,7 @@
         <w:rPr>
           <w:rtl/>
         </w:rPr>
-        <w:t xml:space="preserve">בשביל להדביק את השברים אנחנו צריכים את הדבק המוזהב שמחבר אותם.
-מה הדבק שלכם? מה נותן לכם כח?
-בעולם הפסיכולוגיה מדברים על “חוסן” כעל היכולת להתמודד עם מצבים קשים ומורכבים.
-נפרוס לפני התלמידים את הכותרות של רכיבי החוסן- חמלה עצמית, שייכות, משמעות, גמישות, חיבור לגוף, דמיון ויצירה.
-נבקש מכל תלמיד לכתוב לעצמו רשימה של כמה שיותר דברים בכל כותרת איתם הוא נפגש במהלך השנה. מה הם הדברים שנתנו לו כח לעבור את השנה המורכבת הזו, ומה הוא היה רוצה עוד לחזק אצלו.</w:t>
+        <w:t>בשביל להדביק את השברים אנחנו צריכים את הדבק המוזהב שמחבר אותם.  מה הדבק שלכם? מה נותן לכם כח?  בעולם הפסיכולוגיה מדברים על “חוסן” כעל היכולת להתמודד עם מצבים קשים ומורכבים. נפרוס לפני התלמידים את הכותרות של רכיבי החוסן- חמלה עצמית, שייכות, משמעות, גמישות, חיבור לגוף, דמיון ויצירה. נבקש מכל תלמיד לכתוב לעצמו רשימה של כמה שיותר דברים בכל כותרת איתם הוא נפגש במהלך השנה. מה הם הדברים שנתנו לו כח לעבור את השנה המורכבת הזו, ומה הוא היה רוצה עוד לחזק אצלו.</w:t>
       </w:r>
     </w:p>
     <w:p>
@@ -322,10 +260,10 @@
       </w:pPr>
       <w:r>
         <w:rPr>
+          <w:b/>
+          <w:bCs/>
           <w:sz w:val="50"/>
           <w:szCs w:val="50"/>
-          <w:b w:val="1"/>
-          <w:bCs w:val="1"/>
           <w:rtl/>
         </w:rPr>
         <w:t xml:space="preserve">אסיף: </w:t>
@@ -339,81 +277,96 @@
         <w:rPr>
           <w:rtl/>
         </w:rPr>
-        <w:t xml:space="preserve">“שבירתו היא תקנתו”. כשקורים לאדם מאורעות קשים משהו בתוכו נשבר.
-השבר הוא קשה וכואב ואנחנו מייחלים לחיים של שפע טובה וברכה.
-היכן התקנה?
-השבר הוא חלק מהחיים וקורה לנו בעוצמה כזו או אחרת כל הזמן. עם השבר נסדק משהו בתבניות שהיינו רגילים אליהם – דרכי חשיבה מסוימות, התנהגות, תפיסות וכד’… כאן גם נכנסת האפשרות לתיקון. כוחות  חדשים שמאפשרים לנו למלא את הסדקים שבין השברים. הכוחות הללו הופכים להיות חלק מאיתנו ומאירים לנו חלקים נוספים בחיינו. הם לא מכסים על השברים, אנחנו לא מתייחסים לכאב כאילו הוא לא קרה, אבל אנחנו כן מנסים למצוא את “דבק הזהב” שיצור מהשבר כלי חדש.
-שתהיה לנו שנה טובה ומתוקה!</w:t>
+        <w:lastRenderedPageBreak/>
+        <w:t>“שבירתו היא תקנתו”. כשקורים לאדם מאורעות קשים משהו בתוכו נשבר. השבר הוא קשה וכואב ואנחנו מייחלים לחיים של שפע טובה וברכה. היכן התקנה? השבר הוא חלק מהחיים וקורה לנו בעוצמה כזו או אחרת כל הזמן. עם השבר נסדק משהו בתבניות שהיינו רגילים אליהם – דרכי חשיבה מסוימות, התנהגות, תפיסות וכד’… כאן גם נכנסת האפשרות לתיקון. כוחות  חדשים שמאפשרים לנו למלא את הסדקים שבין השברים. הכוחות הללו הופכים להיות חלק מאיתנו ומאירים לנו חלקים נוספים בחיינו. הם לא מכסים על השברים, אנחנו לא מתייחסים לכאב כאילו הוא לא קרה, אבל אנחנו כן מנסים למצוא את “דבק הזהב” שיצור מהשבר כלי חדש.   שתהיה לנו שנה טובה ומתוקה!</w:t>
       </w:r>
     </w:p>
     <w:sectPr>
-      <w:headerReference w:type="default" r:id="rId7"/>
-      <w:footerReference w:type="default" r:id="rId8"/>
+      <w:headerReference w:type="default" r:id="rId6"/>
+      <w:footerReference w:type="default" r:id="rId7"/>
       <w:type w:val="continuous"/>
-      <w:pgSz w:orient="portrait" w:w="11905.511811023622" w:h="16837.79527559055"/>
+      <w:pgSz w:w="11905" w:h="16837"/>
       <w:pgMar w:top="1440" w:right="1440" w:bottom="1440" w:left="1440" w:header="720" w:footer="720" w:gutter="0"/>
-      <w:cols w:num="1" w:space="720"/>
+      <w:cols w:space="720"/>
     </w:sectPr>
   </w:body>
 </w:document>
 </file>
 
-<file path=word/comments.xml><?xml version="1.0" encoding="utf-8"?>
-<w:comments xmlns:ve="http://schemas.openxmlformats.org/markup-compatibility/2006" xmlns:o="urn:schemas-microsoft-com:office:office" xmlns:r="http://schemas.openxmlformats.org/officeDocument/2006/relationships" xmlns:m="http://schemas.openxmlformats.org/officeDocument/2006/math" xmlns:v="urn:schemas-microsoft-com:vml" xmlns:wp="http://schemas.openxmlformats.org/drawingml/2006/wordprocessingDrawing" xmlns:w10="urn:schemas-microsoft-com:office:word" xmlns:w="http://schemas.openxmlformats.org/wordprocessingml/2006/main" xmlns:wne="http://schemas.microsoft.com/office/word/2006/wordml"/>
+<file path=word/endnotes.xml><?xml version="1.0" encoding="utf-8"?>
+<w:endnotes xmlns:wpc="http://schemas.microsoft.com/office/word/2010/wordprocessingCanvas" xmlns:cx="http://schemas.microsoft.com/office/drawing/2014/chartex" xmlns:cx1="http://schemas.microsoft.com/office/drawing/2015/9/8/chartex" xmlns:cx2="http://schemas.microsoft.com/office/drawing/2015/10/21/chartex" xmlns:cx3="http://schemas.microsoft.com/office/drawing/2016/5/9/chartex" xmlns:cx4="http://schemas.microsoft.com/office/drawing/2016/5/10/chartex" xmlns:cx5="http://schemas.microsoft.com/office/drawing/2016/5/11/chartex" xmlns:cx6="http://schemas.microsoft.com/office/drawing/2016/5/12/chartex" xmlns:cx7="http://schemas.microsoft.com/office/drawing/2016/5/13/chartex" xmlns:cx8="http://schemas.microsoft.com/office/drawing/2016/5/14/chartex" xmlns:mc="http://schemas.openxmlformats.org/markup-compatibility/2006" xmlns:aink="http://schemas.microsoft.com/office/drawing/2016/ink" xmlns:am3d="http://schemas.microsoft.com/office/drawing/2017/model3d" xmlns:o="urn:schemas-microsoft-com:office:office" xmlns:oel="http://schemas.microsoft.com/office/2019/extlst" xmlns:r="http://schemas.openxmlformats.org/officeDocument/2006/relationships" xmlns:m="http://schemas.openxmlformats.org/officeDocument/2006/math" xmlns:v="urn:schemas-microsoft-com:vml" xmlns:wp14="http://schemas.microsoft.com/office/word/2010/wordprocessingDrawing" xmlns:wp="http://schemas.openxmlformats.org/drawingml/2006/wordprocessingDrawing" xmlns:w10="urn:schemas-microsoft-com:office:word" xmlns:w="http://schemas.openxmlformats.org/wordprocessingml/2006/main" xmlns:w14="http://schemas.microsoft.com/office/word/2010/wordml" xmlns:w15="http://schemas.microsoft.com/office/word/2012/wordml" xmlns:w16cex="http://schemas.microsoft.com/office/word/2018/wordml/cex" xmlns:w16cid="http://schemas.microsoft.com/office/word/2016/wordml/cid" xmlns:w16="http://schemas.microsoft.com/office/word/2018/wordml" xmlns:w16du="http://schemas.microsoft.com/office/word/2023/wordml/word16du" xmlns:w16sdtdh="http://schemas.microsoft.com/office/word/2020/wordml/sdtdatahash" xmlns:w16sdtfl="http://schemas.microsoft.com/office/word/2024/wordml/sdtformatlock" xmlns:w16se="http://schemas.microsoft.com/office/word/2015/wordml/symex" xmlns:wpg="http://schemas.microsoft.com/office/word/2010/wordprocessingGroup" xmlns:wpi="http://schemas.microsoft.com/office/word/2010/wordprocessingInk" xmlns:wne="http://schemas.microsoft.com/office/word/2006/wordml" xmlns:wps="http://schemas.microsoft.com/office/word/2010/wordprocessingShape" mc:Ignorable="w14 w15 w16se w16cid w16 w16cex w16sdtdh w16sdtfl w16du wp14">
+  <w:endnote w:type="separator" w:id="-1">
+    <w:p>
+      <w:pPr>
+        <w:spacing w:after="0" w:line="240" w:lineRule="auto"/>
+      </w:pPr>
+      <w:r>
+        <w:separator/>
+      </w:r>
+    </w:p>
+  </w:endnote>
+  <w:endnote w:type="continuationSeparator" w:id="0">
+    <w:p>
+      <w:pPr>
+        <w:spacing w:after="0" w:line="240" w:lineRule="auto"/>
+      </w:pPr>
+      <w:r>
+        <w:continuationSeparator/>
+      </w:r>
+    </w:p>
+  </w:endnote>
+</w:endnotes>
 </file>
 
 <file path=word/footer1.xml><?xml version="1.0" encoding="utf-8"?>
-<w:ftr xmlns:ve="http://schemas.openxmlformats.org/markup-compatibility/2006" xmlns:o="urn:schemas-microsoft-com:office:office" xmlns:r="http://schemas.openxmlformats.org/officeDocument/2006/relationships" xmlns:m="http://schemas.openxmlformats.org/officeDocument/2006/math" xmlns:v="urn:schemas-microsoft-com:vml" xmlns:wp="http://schemas.openxmlformats.org/drawingml/2006/wordprocessingDrawing" xmlns:w10="urn:schemas-microsoft-com:office:word" xmlns:w="http://schemas.openxmlformats.org/wordprocessingml/2006/main" xmlns:wne="http://schemas.microsoft.com/office/word/2006/wordml">
+<w:ftr xmlns:wpc="http://schemas.microsoft.com/office/word/2010/wordprocessingCanvas" xmlns:cx="http://schemas.microsoft.com/office/drawing/2014/chartex" xmlns:cx1="http://schemas.microsoft.com/office/drawing/2015/9/8/chartex" xmlns:cx2="http://schemas.microsoft.com/office/drawing/2015/10/21/chartex" xmlns:cx3="http://schemas.microsoft.com/office/drawing/2016/5/9/chartex" xmlns:cx4="http://schemas.microsoft.com/office/drawing/2016/5/10/chartex" xmlns:cx5="http://schemas.microsoft.com/office/drawing/2016/5/11/chartex" xmlns:cx6="http://schemas.microsoft.com/office/drawing/2016/5/12/chartex" xmlns:cx7="http://schemas.microsoft.com/office/drawing/2016/5/13/chartex" xmlns:cx8="http://schemas.microsoft.com/office/drawing/2016/5/14/chartex" xmlns:mc="http://schemas.openxmlformats.org/markup-compatibility/2006" xmlns:aink="http://schemas.microsoft.com/office/drawing/2016/ink" xmlns:am3d="http://schemas.microsoft.com/office/drawing/2017/model3d" xmlns:o="urn:schemas-microsoft-com:office:office" xmlns:oel="http://schemas.microsoft.com/office/2019/extlst" xmlns:r="http://schemas.openxmlformats.org/officeDocument/2006/relationships" xmlns:m="http://schemas.openxmlformats.org/officeDocument/2006/math" xmlns:v="urn:schemas-microsoft-com:vml" xmlns:wp14="http://schemas.microsoft.com/office/word/2010/wordprocessingDrawing" xmlns:wp="http://schemas.openxmlformats.org/drawingml/2006/wordprocessingDrawing" xmlns:w10="urn:schemas-microsoft-com:office:word" xmlns:w="http://schemas.openxmlformats.org/wordprocessingml/2006/main" xmlns:w14="http://schemas.microsoft.com/office/word/2010/wordml" xmlns:w15="http://schemas.microsoft.com/office/word/2012/wordml" xmlns:w16cex="http://schemas.microsoft.com/office/word/2018/wordml/cex" xmlns:w16cid="http://schemas.microsoft.com/office/word/2016/wordml/cid" xmlns:w16="http://schemas.microsoft.com/office/word/2018/wordml" xmlns:w16du="http://schemas.microsoft.com/office/word/2023/wordml/word16du" xmlns:w16sdtdh="http://schemas.microsoft.com/office/word/2020/wordml/sdtdatahash" xmlns:w16sdtfl="http://schemas.microsoft.com/office/word/2024/wordml/sdtformatlock" xmlns:w16se="http://schemas.microsoft.com/office/word/2015/wordml/symex" xmlns:wpg="http://schemas.microsoft.com/office/word/2010/wordprocessingGroup" xmlns:wpi="http://schemas.microsoft.com/office/word/2010/wordprocessingInk" xmlns:wne="http://schemas.microsoft.com/office/word/2006/wordml" xmlns:wps="http://schemas.microsoft.com/office/word/2010/wordprocessingShape" mc:Ignorable="w14 w15 w16se w16cid w16 w16cex w16sdtdh w16sdtfl w16du wp14">
   <w:p>
     <w:pPr>
       <w:jc w:val="center"/>
     </w:pPr>
     <w:r>
+      <w:t>.</w:t>
+    </w:r>
+    <w:r>
+      <w:fldChar w:fldCharType="begin"/>
+    </w:r>
+    <w:r>
+      <w:instrText>NUMPAGES</w:instrText>
+    </w:r>
+    <w:r>
+      <w:fldChar w:fldCharType="separate"/>
+    </w:r>
+    <w:r>
       <w:rPr>
-        <w:rStyle w:val=""/>
+        <w:noProof/>
       </w:rPr>
-      <w:t xml:space="preserve">.</w:t>
+      <w:t>2</w:t>
+    </w:r>
+    <w:r>
+      <w:fldChar w:fldCharType="end"/>
+    </w:r>
+    <w:r>
+      <w:t xml:space="preserve"> מתוך </w:t>
     </w:r>
     <w:r>
       <w:fldChar w:fldCharType="begin"/>
     </w:r>
     <w:r>
+      <w:instrText>PAGE</w:instrText>
+    </w:r>
+    <w:r>
+      <w:fldChar w:fldCharType="separate"/>
+    </w:r>
+    <w:r>
       <w:rPr>
-        <w:rStyle w:val=""/>
+        <w:noProof/>
       </w:rPr>
-      <w:instrText xml:space="preserve">NUMPAGES</w:instrText>
-    </w:r>
-    <w:r>
-      <w:fldChar w:fldCharType="separate"/>
+      <w:t>1</w:t>
     </w:r>
     <w:r>
       <w:fldChar w:fldCharType="end"/>
     </w:r>
     <w:r>
-      <w:rPr>
-        <w:rStyle w:val=""/>
-      </w:rPr>
-      <w:t xml:space="preserve"> מתוך </w:t>
-    </w:r>
-    <w:r>
-      <w:fldChar w:fldCharType="begin"/>
-    </w:r>
-    <w:r>
-      <w:rPr>
-        <w:rStyle w:val=""/>
-      </w:rPr>
-      <w:instrText xml:space="preserve">PAGE</w:instrText>
-    </w:r>
-    <w:r>
-      <w:fldChar w:fldCharType="separate"/>
-    </w:r>
-    <w:r>
-      <w:fldChar w:fldCharType="end"/>
-    </w:r>
-    <w:r>
-      <w:rPr>
-        <w:rStyle w:val=""/>
-      </w:rPr>
       <w:t xml:space="preserve"> עמוד</w:t>
     </w:r>
   </w:p>
@@ -423,7 +376,7 @@
         <w:sz w:val="16"/>
         <w:szCs w:val="16"/>
       </w:rPr>
-      <w:t xml:space="preserve">לב לדעת - המכללה האקדמית הרצוג, אלון שבות 90433</w:t>
+      <w:t>לב לדעת - המכללה האקדמית הרצוג, אלון שבות 90433</w:t>
     </w:r>
   </w:p>
   <w:p>
@@ -432,7 +385,7 @@
         <w:sz w:val="16"/>
         <w:szCs w:val="16"/>
       </w:rPr>
-      <w:t xml:space="preserve">www.levladaat.org  - atarlevladaat@gmail.com</w:t>
+      <w:t>www.levladaat.org  - atarlevladaat@gmail.com</w:t>
     </w:r>
   </w:p>
   <w:p>
@@ -441,77 +394,568 @@
         <w:sz w:val="16"/>
         <w:szCs w:val="16"/>
       </w:rPr>
-      <w:t xml:space="preserve">2024 ©  כל הזכויות שמורות ללב לדעת</w:t>
+      <w:t>2024 ©  כל הזכויות שמורות ללב לדעת</w:t>
     </w:r>
   </w:p>
 </w:ftr>
 </file>
 
+<file path=word/footnotes.xml><?xml version="1.0" encoding="utf-8"?>
+<w:footnotes xmlns:wpc="http://schemas.microsoft.com/office/word/2010/wordprocessingCanvas" xmlns:cx="http://schemas.microsoft.com/office/drawing/2014/chartex" xmlns:cx1="http://schemas.microsoft.com/office/drawing/2015/9/8/chartex" xmlns:cx2="http://schemas.microsoft.com/office/drawing/2015/10/21/chartex" xmlns:cx3="http://schemas.microsoft.com/office/drawing/2016/5/9/chartex" xmlns:cx4="http://schemas.microsoft.com/office/drawing/2016/5/10/chartex" xmlns:cx5="http://schemas.microsoft.com/office/drawing/2016/5/11/chartex" xmlns:cx6="http://schemas.microsoft.com/office/drawing/2016/5/12/chartex" xmlns:cx7="http://schemas.microsoft.com/office/drawing/2016/5/13/chartex" xmlns:cx8="http://schemas.microsoft.com/office/drawing/2016/5/14/chartex" xmlns:mc="http://schemas.openxmlformats.org/markup-compatibility/2006" xmlns:aink="http://schemas.microsoft.com/office/drawing/2016/ink" xmlns:am3d="http://schemas.microsoft.com/office/drawing/2017/model3d" xmlns:o="urn:schemas-microsoft-com:office:office" xmlns:oel="http://schemas.microsoft.com/office/2019/extlst" xmlns:r="http://schemas.openxmlformats.org/officeDocument/2006/relationships" xmlns:m="http://schemas.openxmlformats.org/officeDocument/2006/math" xmlns:v="urn:schemas-microsoft-com:vml" xmlns:wp14="http://schemas.microsoft.com/office/word/2010/wordprocessingDrawing" xmlns:wp="http://schemas.openxmlformats.org/drawingml/2006/wordprocessingDrawing" xmlns:w10="urn:schemas-microsoft-com:office:word" xmlns:w="http://schemas.openxmlformats.org/wordprocessingml/2006/main" xmlns:w14="http://schemas.microsoft.com/office/word/2010/wordml" xmlns:w15="http://schemas.microsoft.com/office/word/2012/wordml" xmlns:w16cex="http://schemas.microsoft.com/office/word/2018/wordml/cex" xmlns:w16cid="http://schemas.microsoft.com/office/word/2016/wordml/cid" xmlns:w16="http://schemas.microsoft.com/office/word/2018/wordml" xmlns:w16du="http://schemas.microsoft.com/office/word/2023/wordml/word16du" xmlns:w16sdtdh="http://schemas.microsoft.com/office/word/2020/wordml/sdtdatahash" xmlns:w16sdtfl="http://schemas.microsoft.com/office/word/2024/wordml/sdtformatlock" xmlns:w16se="http://schemas.microsoft.com/office/word/2015/wordml/symex" xmlns:wpg="http://schemas.microsoft.com/office/word/2010/wordprocessingGroup" xmlns:wpi="http://schemas.microsoft.com/office/word/2010/wordprocessingInk" xmlns:wne="http://schemas.microsoft.com/office/word/2006/wordml" xmlns:wps="http://schemas.microsoft.com/office/word/2010/wordprocessingShape" mc:Ignorable="w14 w15 w16se w16cid w16 w16cex w16sdtdh w16sdtfl w16du wp14">
+  <w:footnote w:type="separator" w:id="-1">
+    <w:p>
+      <w:pPr>
+        <w:spacing w:after="0" w:line="240" w:lineRule="auto"/>
+      </w:pPr>
+      <w:r>
+        <w:separator/>
+      </w:r>
+    </w:p>
+  </w:footnote>
+  <w:footnote w:type="continuationSeparator" w:id="0">
+    <w:p>
+      <w:pPr>
+        <w:spacing w:after="0" w:line="240" w:lineRule="auto"/>
+      </w:pPr>
+      <w:r>
+        <w:continuationSeparator/>
+      </w:r>
+    </w:p>
+  </w:footnote>
+</w:footnotes>
+</file>
+
 <file path=word/header1.xml><?xml version="1.0" encoding="utf-8"?>
-<w:hdr xmlns:ve="http://schemas.openxmlformats.org/markup-compatibility/2006" xmlns:o="urn:schemas-microsoft-com:office:office" xmlns:r="http://schemas.openxmlformats.org/officeDocument/2006/relationships" xmlns:m="http://schemas.openxmlformats.org/officeDocument/2006/math" xmlns:v="urn:schemas-microsoft-com:vml" xmlns:wp="http://schemas.openxmlformats.org/drawingml/2006/wordprocessingDrawing" xmlns:w10="urn:schemas-microsoft-com:office:word" xmlns:w="http://schemas.openxmlformats.org/wordprocessingml/2006/main" xmlns:wne="http://schemas.microsoft.com/office/word/2006/wordml">
+<w:hdr xmlns:wpc="http://schemas.microsoft.com/office/word/2010/wordprocessingCanvas" xmlns:cx="http://schemas.microsoft.com/office/drawing/2014/chartex" xmlns:cx1="http://schemas.microsoft.com/office/drawing/2015/9/8/chartex" xmlns:cx2="http://schemas.microsoft.com/office/drawing/2015/10/21/chartex" xmlns:cx3="http://schemas.microsoft.com/office/drawing/2016/5/9/chartex" xmlns:cx4="http://schemas.microsoft.com/office/drawing/2016/5/10/chartex" xmlns:cx5="http://schemas.microsoft.com/office/drawing/2016/5/11/chartex" xmlns:cx6="http://schemas.microsoft.com/office/drawing/2016/5/12/chartex" xmlns:cx7="http://schemas.microsoft.com/office/drawing/2016/5/13/chartex" xmlns:cx8="http://schemas.microsoft.com/office/drawing/2016/5/14/chartex" xmlns:mc="http://schemas.openxmlformats.org/markup-compatibility/2006" xmlns:aink="http://schemas.microsoft.com/office/drawing/2016/ink" xmlns:am3d="http://schemas.microsoft.com/office/drawing/2017/model3d" xmlns:o="urn:schemas-microsoft-com:office:office" xmlns:oel="http://schemas.microsoft.com/office/2019/extlst" xmlns:r="http://schemas.openxmlformats.org/officeDocument/2006/relationships" xmlns:m="http://schemas.openxmlformats.org/officeDocument/2006/math" xmlns:v="urn:schemas-microsoft-com:vml" xmlns:wp14="http://schemas.microsoft.com/office/word/2010/wordprocessingDrawing" xmlns:wp="http://schemas.openxmlformats.org/drawingml/2006/wordprocessingDrawing" xmlns:w10="urn:schemas-microsoft-com:office:word" xmlns:w="http://schemas.openxmlformats.org/wordprocessingml/2006/main" xmlns:w14="http://schemas.microsoft.com/office/word/2010/wordml" xmlns:w15="http://schemas.microsoft.com/office/word/2012/wordml" xmlns:w16cex="http://schemas.microsoft.com/office/word/2018/wordml/cex" xmlns:w16cid="http://schemas.microsoft.com/office/word/2016/wordml/cid" xmlns:w16="http://schemas.microsoft.com/office/word/2018/wordml" xmlns:w16du="http://schemas.microsoft.com/office/word/2023/wordml/word16du" xmlns:w16sdtdh="http://schemas.microsoft.com/office/word/2020/wordml/sdtdatahash" xmlns:w16sdtfl="http://schemas.microsoft.com/office/word/2024/wordml/sdtformatlock" xmlns:w16se="http://schemas.microsoft.com/office/word/2015/wordml/symex" xmlns:wpg="http://schemas.microsoft.com/office/word/2010/wordprocessingGroup" xmlns:wpi="http://schemas.microsoft.com/office/word/2010/wordprocessingInk" xmlns:wne="http://schemas.microsoft.com/office/word/2006/wordml" xmlns:wps="http://schemas.microsoft.com/office/word/2010/wordprocessingShape" mc:Ignorable="w14 w15 w16se w16cid w16 w16cex w16sdtdh w16sdtfl w16du wp14">
   <w:p>
     <w:pPr>
       <w:jc w:val="right"/>
     </w:pPr>
     <w:r>
-      <w:pict>
-        <v:shape type="#_x0000_t75" style="width:173pt; height:60pt; margin-left:0pt; margin-top:0pt; mso-position-horizontal:left; mso-position-vertical:top; mso-position-horizontal-relative:char; mso-position-vertical-relative:line;">
-          <w10:wrap type="inline"/>
+      <w:rPr>
+        <w:noProof/>
+      </w:rPr>
+      <w:pict w14:anchorId="55CCD7E3">
+        <v:shapetype id="_x0000_t75" coordsize="21600,21600" o:spt="75" o:preferrelative="t" path="m@4@5l@4@11@9@11@9@5xe" filled="f" stroked="f">
+          <v:stroke joinstyle="miter"/>
+          <v:formulas>
+            <v:f eqn="if lineDrawn pixelLineWidth 0"/>
+            <v:f eqn="sum @0 1 0"/>
+            <v:f eqn="sum 0 0 @1"/>
+            <v:f eqn="prod @2 1 2"/>
+            <v:f eqn="prod @3 21600 pixelWidth"/>
+            <v:f eqn="prod @3 21600 pixelHeight"/>
+            <v:f eqn="sum @0 0 1"/>
+            <v:f eqn="prod @6 1 2"/>
+            <v:f eqn="prod @7 21600 pixelWidth"/>
+            <v:f eqn="sum @8 21600 0"/>
+            <v:f eqn="prod @7 21600 pixelHeight"/>
+            <v:f eqn="sum @10 21600 0"/>
+          </v:formulas>
+          <v:path o:extrusionok="f" gradientshapeok="t" o:connecttype="rect"/>
+          <o:lock v:ext="edit" aspectratio="t"/>
+        </v:shapetype>
+        <v:shape id="_x0000_i1025" type="#_x0000_t75" alt="" style="width:173.1pt;height:60.35pt;mso-width-percent:0;mso-height-percent:0;mso-position-horizontal:left;mso-position-horizontal-relative:char;mso-position-vertical:top;mso-position-vertical-relative:line;mso-width-percent:0;mso-height-percent:0">
           <v:imagedata r:id="rId1" o:title=""/>
         </v:shape>
       </w:pict>
     </w:r>
   </w:p>
   <w:p>
-    <w:pPr/>
-    <w:r>
-      <w:rPr/>
-      <w:t xml:space="preserve">בס"ד</w:t>
+    <w:r>
+      <w:t>בס"ד</w:t>
     </w:r>
   </w:p>
   <w:p>
-    <w:pPr/>
-    <w:r>
-      <w:rPr/>
-      <w:t xml:space="preserve">08/09/2024</w:t>
+    <w:r>
+      <w:t>08/09/2024</w:t>
     </w:r>
   </w:p>
   <w:p>
-    <w:pPr/>
-    <w:r>
-      <w:rPr/>
-      <w:t xml:space="preserve">ה' אלול התשפ"ד</w:t>
+    <w:r>
+      <w:t>ה' אלול התשפ"ד</w:t>
     </w:r>
   </w:p>
 </w:hdr>
 </file>
 
-<file path=word/numbering.xml><?xml version="1.0" encoding="utf-8"?>
-<w:numbering xmlns:ve="http://schemas.openxmlformats.org/markup-compatibility/2006" xmlns:o="urn:schemas-microsoft-com:office:office" xmlns:r="http://schemas.openxmlformats.org/officeDocument/2006/relationships" xmlns:m="http://schemas.openxmlformats.org/officeDocument/2006/math" xmlns:v="urn:schemas-microsoft-com:vml" xmlns:wp="http://schemas.openxmlformats.org/drawingml/2006/wordprocessingDrawing" xmlns:w10="urn:schemas-microsoft-com:office:word" xmlns:w="http://schemas.openxmlformats.org/wordprocessingml/2006/main" xmlns:wne="http://schemas.microsoft.com/office/word/2006/wordml"/>
-</file>
-
 <file path=word/styles.xml><?xml version="1.0" encoding="utf-8"?>
-<w:styles xmlns:r="http://schemas.openxmlformats.org/officeDocument/2006/relationships" xmlns:w="http://schemas.openxmlformats.org/wordprocessingml/2006/main">
+<w:styles xmlns:mc="http://schemas.openxmlformats.org/markup-compatibility/2006" xmlns:r="http://schemas.openxmlformats.org/officeDocument/2006/relationships" xmlns:w="http://schemas.openxmlformats.org/wordprocessingml/2006/main" xmlns:w14="http://schemas.microsoft.com/office/word/2010/wordml" xmlns:w15="http://schemas.microsoft.com/office/word/2012/wordml" xmlns:w16cex="http://schemas.microsoft.com/office/word/2018/wordml/cex" xmlns:w16cid="http://schemas.microsoft.com/office/word/2016/wordml/cid" xmlns:w16="http://schemas.microsoft.com/office/word/2018/wordml" xmlns:w16du="http://schemas.microsoft.com/office/word/2023/wordml/word16du" xmlns:w16sdtdh="http://schemas.microsoft.com/office/word/2020/wordml/sdtdatahash" xmlns:w16sdtfl="http://schemas.microsoft.com/office/word/2024/wordml/sdtformatlock" xmlns:w16se="http://schemas.microsoft.com/office/word/2015/wordml/symex" mc:Ignorable="w14 w15 w16se w16cid w16 w16cex w16sdtdh w16sdtfl w16du">
   <w:docDefaults>
     <w:rPrDefault>
       <w:rPr>
-        <w:rFonts w:ascii="Arial" w:hAnsi="Arial" w:eastAsia="Arial" w:cs="Arial"/>
+        <w:rFonts w:ascii="Arial" w:eastAsia="Arial" w:hAnsi="Arial" w:cs="Arial"/>
         <w:sz w:val="28"/>
         <w:szCs w:val="28"/>
-        <w:lang w:val="en-US"/>
+        <w:lang w:val="en-US" w:eastAsia="en-US" w:bidi="he-IL"/>
       </w:rPr>
     </w:rPrDefault>
+    <w:pPrDefault>
+      <w:pPr>
+        <w:spacing w:after="160" w:line="278" w:lineRule="auto"/>
+      </w:pPr>
+    </w:pPrDefault>
   </w:docDefaults>
-  <w:style w:type="paragraph" w:default="1" w:styleId="Normal">
+  <w:latentStyles w:defLockedState="0" w:defUIPriority="99" w:defSemiHidden="0" w:defUnhideWhenUsed="0" w:defQFormat="0" w:count="376">
+    <w:lsdException w:name="Normal" w:uiPriority="0" w:qFormat="1"/>
+    <w:lsdException w:name="heading 1" w:uiPriority="9" w:qFormat="1"/>
+    <w:lsdException w:name="heading 2" w:semiHidden="1" w:uiPriority="9" w:unhideWhenUsed="1" w:qFormat="1"/>
+    <w:lsdException w:name="heading 3" w:semiHidden="1" w:uiPriority="9" w:unhideWhenUsed="1" w:qFormat="1"/>
+    <w:lsdException w:name="heading 4" w:semiHidden="1" w:uiPriority="9" w:unhideWhenUsed="1" w:qFormat="1"/>
+    <w:lsdException w:name="heading 5" w:semiHidden="1" w:uiPriority="9" w:unhideWhenUsed="1" w:qFormat="1"/>
+    <w:lsdException w:name="heading 6" w:semiHidden="1" w:uiPriority="9" w:unhideWhenUsed="1" w:qFormat="1"/>
+    <w:lsdException w:name="heading 7" w:semiHidden="1" w:uiPriority="9" w:unhideWhenUsed="1" w:qFormat="1"/>
+    <w:lsdException w:name="heading 8" w:semiHidden="1" w:uiPriority="9" w:unhideWhenUsed="1" w:qFormat="1"/>
+    <w:lsdException w:name="heading 9" w:semiHidden="1" w:uiPriority="9" w:unhideWhenUsed="1" w:qFormat="1"/>
+    <w:lsdException w:name="index 1" w:semiHidden="1" w:unhideWhenUsed="1"/>
+    <w:lsdException w:name="index 2" w:semiHidden="1" w:unhideWhenUsed="1"/>
+    <w:lsdException w:name="index 3" w:semiHidden="1" w:unhideWhenUsed="1"/>
+    <w:lsdException w:name="index 4" w:semiHidden="1" w:unhideWhenUsed="1"/>
+    <w:lsdException w:name="index 5" w:semiHidden="1" w:unhideWhenUsed="1"/>
+    <w:lsdException w:name="index 6" w:semiHidden="1" w:unhideWhenUsed="1"/>
+    <w:lsdException w:name="index 7" w:semiHidden="1" w:unhideWhenUsed="1"/>
+    <w:lsdException w:name="index 8" w:semiHidden="1" w:unhideWhenUsed="1"/>
+    <w:lsdException w:name="index 9" w:semiHidden="1" w:unhideWhenUsed="1"/>
+    <w:lsdException w:name="toc 1" w:semiHidden="1" w:uiPriority="39" w:unhideWhenUsed="1"/>
+    <w:lsdException w:name="toc 2" w:semiHidden="1" w:uiPriority="39" w:unhideWhenUsed="1"/>
+    <w:lsdException w:name="toc 3" w:semiHidden="1" w:uiPriority="39" w:unhideWhenUsed="1"/>
+    <w:lsdException w:name="toc 4" w:semiHidden="1" w:uiPriority="39" w:unhideWhenUsed="1"/>
+    <w:lsdException w:name="toc 5" w:semiHidden="1" w:uiPriority="39" w:unhideWhenUsed="1"/>
+    <w:lsdException w:name="toc 6" w:semiHidden="1" w:uiPriority="39" w:unhideWhenUsed="1"/>
+    <w:lsdException w:name="toc 7" w:semiHidden="1" w:uiPriority="39" w:unhideWhenUsed="1"/>
+    <w:lsdException w:name="toc 8" w:semiHidden="1" w:uiPriority="39" w:unhideWhenUsed="1"/>
+    <w:lsdException w:name="toc 9" w:semiHidden="1" w:uiPriority="39" w:unhideWhenUsed="1"/>
+    <w:lsdException w:name="Normal Indent" w:semiHidden="1" w:unhideWhenUsed="1"/>
+    <w:lsdException w:name="footnote text" w:semiHidden="1" w:unhideWhenUsed="1"/>
+    <w:lsdException w:name="annotation text" w:semiHidden="1" w:unhideWhenUsed="1"/>
+    <w:lsdException w:name="header" w:semiHidden="1" w:unhideWhenUsed="1"/>
+    <w:lsdException w:name="footer" w:semiHidden="1" w:unhideWhenUsed="1"/>
+    <w:lsdException w:name="index heading" w:semiHidden="1" w:unhideWhenUsed="1"/>
+    <w:lsdException w:name="caption" w:semiHidden="1" w:uiPriority="35" w:unhideWhenUsed="1" w:qFormat="1"/>
+    <w:lsdException w:name="table of figures" w:semiHidden="1" w:unhideWhenUsed="1"/>
+    <w:lsdException w:name="envelope address" w:semiHidden="1" w:unhideWhenUsed="1"/>
+    <w:lsdException w:name="envelope return" w:semiHidden="1" w:unhideWhenUsed="1"/>
+    <w:lsdException w:name="footnote reference" w:semiHidden="1" w:unhideWhenUsed="1"/>
+    <w:lsdException w:name="annotation reference" w:semiHidden="1" w:unhideWhenUsed="1"/>
+    <w:lsdException w:name="line number" w:semiHidden="1" w:unhideWhenUsed="1"/>
+    <w:lsdException w:name="page number" w:semiHidden="1" w:unhideWhenUsed="1"/>
+    <w:lsdException w:name="endnote reference" w:semiHidden="1" w:unhideWhenUsed="1"/>
+    <w:lsdException w:name="endnote text" w:semiHidden="1" w:unhideWhenUsed="1"/>
+    <w:lsdException w:name="table of authorities" w:semiHidden="1" w:unhideWhenUsed="1"/>
+    <w:lsdException w:name="macro" w:semiHidden="1" w:unhideWhenUsed="1"/>
+    <w:lsdException w:name="toa heading" w:semiHidden="1" w:unhideWhenUsed="1"/>
+    <w:lsdException w:name="List" w:semiHidden="1" w:unhideWhenUsed="1"/>
+    <w:lsdException w:name="List Bullet" w:semiHidden="1" w:unhideWhenUsed="1"/>
+    <w:lsdException w:name="List Number" w:semiHidden="1" w:unhideWhenUsed="1"/>
+    <w:lsdException w:name="List 2" w:semiHidden="1" w:unhideWhenUsed="1"/>
+    <w:lsdException w:name="List 3" w:semiHidden="1" w:unhideWhenUsed="1"/>
+    <w:lsdException w:name="List 4" w:semiHidden="1" w:unhideWhenUsed="1"/>
+    <w:lsdException w:name="List 5" w:semiHidden="1" w:unhideWhenUsed="1"/>
+    <w:lsdException w:name="List Bullet 2" w:semiHidden="1" w:unhideWhenUsed="1"/>
+    <w:lsdException w:name="List Bullet 3" w:semiHidden="1" w:unhideWhenUsed="1"/>
+    <w:lsdException w:name="List Bullet 4" w:semiHidden="1" w:unhideWhenUsed="1"/>
+    <w:lsdException w:name="List Bullet 5" w:semiHidden="1" w:unhideWhenUsed="1"/>
+    <w:lsdException w:name="List Number 2" w:semiHidden="1" w:unhideWhenUsed="1"/>
+    <w:lsdException w:name="List Number 3" w:semiHidden="1" w:unhideWhenUsed="1"/>
+    <w:lsdException w:name="List Number 4" w:semiHidden="1" w:unhideWhenUsed="1"/>
+    <w:lsdException w:name="List Number 5" w:semiHidden="1" w:unhideWhenUsed="1"/>
+    <w:lsdException w:name="Title" w:uiPriority="10" w:qFormat="1"/>
+    <w:lsdException w:name="Closing" w:semiHidden="1" w:unhideWhenUsed="1"/>
+    <w:lsdException w:name="Signature" w:semiHidden="1" w:unhideWhenUsed="1"/>
+    <w:lsdException w:name="Default Paragraph Font" w:semiHidden="1" w:uiPriority="1" w:unhideWhenUsed="1"/>
+    <w:lsdException w:name="Body Text" w:semiHidden="1" w:unhideWhenUsed="1"/>
+    <w:lsdException w:name="Body Text Indent" w:semiHidden="1" w:unhideWhenUsed="1"/>
+    <w:lsdException w:name="List Continue" w:semiHidden="1" w:unhideWhenUsed="1"/>
+    <w:lsdException w:name="List Continue 2" w:semiHidden="1" w:unhideWhenUsed="1"/>
+    <w:lsdException w:name="List Continue 3" w:semiHidden="1" w:unhideWhenUsed="1"/>
+    <w:lsdException w:name="List Continue 4" w:semiHidden="1" w:unhideWhenUsed="1"/>
+    <w:lsdException w:name="List Continue 5" w:semiHidden="1" w:unhideWhenUsed="1"/>
+    <w:lsdException w:name="Message Header" w:semiHidden="1" w:unhideWhenUsed="1"/>
+    <w:lsdException w:name="Subtitle" w:uiPriority="11" w:qFormat="1"/>
+    <w:lsdException w:name="Salutation" w:semiHidden="1" w:unhideWhenUsed="1"/>
+    <w:lsdException w:name="Date" w:semiHidden="1" w:unhideWhenUsed="1"/>
+    <w:lsdException w:name="Body Text First Indent" w:semiHidden="1" w:unhideWhenUsed="1"/>
+    <w:lsdException w:name="Body Text First Indent 2" w:semiHidden="1" w:unhideWhenUsed="1"/>
+    <w:lsdException w:name="Note Heading" w:semiHidden="1" w:unhideWhenUsed="1"/>
+    <w:lsdException w:name="Body Text 2" w:semiHidden="1" w:unhideWhenUsed="1"/>
+    <w:lsdException w:name="Body Text 3" w:semiHidden="1" w:unhideWhenUsed="1"/>
+    <w:lsdException w:name="Body Text Indent 2" w:semiHidden="1" w:unhideWhenUsed="1"/>
+    <w:lsdException w:name="Body Text Indent 3" w:semiHidden="1" w:unhideWhenUsed="1"/>
+    <w:lsdException w:name="Block Text" w:semiHidden="1" w:unhideWhenUsed="1"/>
+    <w:lsdException w:name="Hyperlink" w:semiHidden="1" w:unhideWhenUsed="1"/>
+    <w:lsdException w:name="FollowedHyperlink" w:semiHidden="1" w:unhideWhenUsed="1"/>
+    <w:lsdException w:name="Strong" w:uiPriority="22" w:qFormat="1"/>
+    <w:lsdException w:name="Emphasis" w:uiPriority="20" w:qFormat="1"/>
+    <w:lsdException w:name="Document Map" w:semiHidden="1" w:unhideWhenUsed="1"/>
+    <w:lsdException w:name="Plain Text" w:semiHidden="1" w:unhideWhenUsed="1"/>
+    <w:lsdException w:name="E-mail Signature" w:semiHidden="1" w:unhideWhenUsed="1"/>
+    <w:lsdException w:name="HTML Top of Form" w:semiHidden="1" w:unhideWhenUsed="1"/>
+    <w:lsdException w:name="HTML Bottom of Form" w:semiHidden="1" w:unhideWhenUsed="1"/>
+    <w:lsdException w:name="Normal (Web)" w:semiHidden="1" w:unhideWhenUsed="1"/>
+    <w:lsdException w:name="HTML Acronym" w:semiHidden="1" w:unhideWhenUsed="1"/>
+    <w:lsdException w:name="HTML Address" w:semiHidden="1" w:unhideWhenUsed="1"/>
+    <w:lsdException w:name="HTML Cite" w:semiHidden="1" w:unhideWhenUsed="1"/>
+    <w:lsdException w:name="HTML Code" w:semiHidden="1" w:unhideWhenUsed="1"/>
+    <w:lsdException w:name="HTML Definition" w:semiHidden="1" w:unhideWhenUsed="1"/>
+    <w:lsdException w:name="HTML Keyboard" w:semiHidden="1" w:unhideWhenUsed="1"/>
+    <w:lsdException w:name="HTML Preformatted" w:semiHidden="1" w:unhideWhenUsed="1"/>
+    <w:lsdException w:name="HTML Sample" w:semiHidden="1" w:unhideWhenUsed="1"/>
+    <w:lsdException w:name="HTML Typewriter" w:semiHidden="1" w:unhideWhenUsed="1"/>
+    <w:lsdException w:name="HTML Variable" w:semiHidden="1" w:unhideWhenUsed="1"/>
+    <w:lsdException w:name="Normal Table" w:semiHidden="1" w:unhideWhenUsed="1"/>
+    <w:lsdException w:name="annotation subject" w:semiHidden="1" w:unhideWhenUsed="1"/>
+    <w:lsdException w:name="No List" w:semiHidden="1" w:unhideWhenUsed="1"/>
+    <w:lsdException w:name="Outline List 1" w:semiHidden="1" w:unhideWhenUsed="1"/>
+    <w:lsdException w:name="Outline List 2" w:semiHidden="1" w:unhideWhenUsed="1"/>
+    <w:lsdException w:name="Outline List 3" w:semiHidden="1" w:unhideWhenUsed="1"/>
+    <w:lsdException w:name="Table Simple 1" w:semiHidden="1" w:unhideWhenUsed="1"/>
+    <w:lsdException w:name="Table Simple 2" w:semiHidden="1" w:unhideWhenUsed="1"/>
+    <w:lsdException w:name="Table Simple 3" w:semiHidden="1" w:unhideWhenUsed="1"/>
+    <w:lsdException w:name="Table Classic 1" w:semiHidden="1" w:unhideWhenUsed="1"/>
+    <w:lsdException w:name="Table Classic 2" w:semiHidden="1" w:unhideWhenUsed="1"/>
+    <w:lsdException w:name="Table Classic 3" w:semiHidden="1" w:unhideWhenUsed="1"/>
+    <w:lsdException w:name="Table Classic 4" w:semiHidden="1" w:unhideWhenUsed="1"/>
+    <w:lsdException w:name="Table Colorful 1" w:semiHidden="1" w:unhideWhenUsed="1"/>
+    <w:lsdException w:name="Table Colorful 2" w:semiHidden="1" w:unhideWhenUsed="1"/>
+    <w:lsdException w:name="Table Colorful 3" w:semiHidden="1" w:unhideWhenUsed="1"/>
+    <w:lsdException w:name="Table Columns 1" w:semiHidden="1" w:unhideWhenUsed="1"/>
+    <w:lsdException w:name="Table Columns 2" w:semiHidden="1" w:unhideWhenUsed="1"/>
+    <w:lsdException w:name="Table Columns 3" w:semiHidden="1" w:unhideWhenUsed="1"/>
+    <w:lsdException w:name="Table Columns 4" w:semiHidden="1" w:unhideWhenUsed="1"/>
+    <w:lsdException w:name="Table Columns 5" w:semiHidden="1" w:unhideWhenUsed="1"/>
+    <w:lsdException w:name="Table Grid 1" w:semiHidden="1" w:unhideWhenUsed="1"/>
+    <w:lsdException w:name="Table Grid 2" w:semiHidden="1" w:unhideWhenUsed="1"/>
+    <w:lsdException w:name="Table Grid 3" w:semiHidden="1" w:unhideWhenUsed="1"/>
+    <w:lsdException w:name="Table Grid 4" w:semiHidden="1" w:unhideWhenUsed="1"/>
+    <w:lsdException w:name="Table Grid 5" w:semiHidden="1" w:unhideWhenUsed="1"/>
+    <w:lsdException w:name="Table Grid 6" w:semiHidden="1" w:unhideWhenUsed="1"/>
+    <w:lsdException w:name="Table Grid 7" w:semiHidden="1" w:unhideWhenUsed="1"/>
+    <w:lsdException w:name="Table Grid 8" w:semiHidden="1" w:unhideWhenUsed="1"/>
+    <w:lsdException w:name="Table List 1" w:semiHidden="1" w:unhideWhenUsed="1"/>
+    <w:lsdException w:name="Table List 2" w:semiHidden="1" w:unhideWhenUsed="1"/>
+    <w:lsdException w:name="Table List 3" w:semiHidden="1" w:unhideWhenUsed="1"/>
+    <w:lsdException w:name="Table List 4" w:semiHidden="1" w:unhideWhenUsed="1"/>
+    <w:lsdException w:name="Table List 5" w:semiHidden="1" w:unhideWhenUsed="1"/>
+    <w:lsdException w:name="Table List 6" w:semiHidden="1" w:unhideWhenUsed="1"/>
+    <w:lsdException w:name="Table List 7" w:semiHidden="1" w:unhideWhenUsed="1"/>
+    <w:lsdException w:name="Table List 8" w:semiHidden="1" w:unhideWhenUsed="1"/>
+    <w:lsdException w:name="Table 3D effects 1" w:semiHidden="1" w:unhideWhenUsed="1"/>
+    <w:lsdException w:name="Table 3D effects 2" w:semiHidden="1" w:unhideWhenUsed="1"/>
+    <w:lsdException w:name="Table 3D effects 3" w:semiHidden="1" w:unhideWhenUsed="1"/>
+    <w:lsdException w:name="Table Contemporary" w:semiHidden="1" w:unhideWhenUsed="1"/>
+    <w:lsdException w:name="Table Elegant" w:semiHidden="1" w:unhideWhenUsed="1"/>
+    <w:lsdException w:name="Table Professional" w:semiHidden="1" w:unhideWhenUsed="1"/>
+    <w:lsdException w:name="Table Subtle 1" w:semiHidden="1" w:unhideWhenUsed="1"/>
+    <w:lsdException w:name="Table Subtle 2" w:semiHidden="1" w:unhideWhenUsed="1"/>
+    <w:lsdException w:name="Table Web 1" w:semiHidden="1" w:unhideWhenUsed="1"/>
+    <w:lsdException w:name="Table Web 2" w:semiHidden="1" w:unhideWhenUsed="1"/>
+    <w:lsdException w:name="Table Web 3" w:semiHidden="1" w:unhideWhenUsed="1"/>
+    <w:lsdException w:name="Balloon Text" w:semiHidden="1" w:unhideWhenUsed="1"/>
+    <w:lsdException w:name="Table Grid" w:uiPriority="39"/>
+    <w:lsdException w:name="Table Theme" w:semiHidden="1" w:unhideWhenUsed="1"/>
+    <w:lsdException w:name="Placeholder Text" w:semiHidden="1"/>
+    <w:lsdException w:name="No Spacing" w:uiPriority="1" w:qFormat="1"/>
+    <w:lsdException w:name="Light Shading" w:uiPriority="60"/>
+    <w:lsdException w:name="Light List" w:uiPriority="61"/>
+    <w:lsdException w:name="Light Grid" w:uiPriority="62"/>
+    <w:lsdException w:name="Medium Shading 1" w:uiPriority="63"/>
+    <w:lsdException w:name="Medium Shading 2" w:uiPriority="64"/>
+    <w:lsdException w:name="Medium List 1" w:uiPriority="65"/>
+    <w:lsdException w:name="Medium List 2" w:uiPriority="66"/>
+    <w:lsdException w:name="Medium Grid 1" w:uiPriority="67"/>
+    <w:lsdException w:name="Medium Grid 2" w:uiPriority="68"/>
+    <w:lsdException w:name="Medium Grid 3" w:uiPriority="69"/>
+    <w:lsdException w:name="Dark List" w:uiPriority="70"/>
+    <w:lsdException w:name="Colorful Shading" w:uiPriority="71"/>
+    <w:lsdException w:name="Colorful List" w:uiPriority="72"/>
+    <w:lsdException w:name="Colorful Grid" w:uiPriority="73"/>
+    <w:lsdException w:name="Light Shading Accent 1" w:uiPriority="60"/>
+    <w:lsdException w:name="Light List Accent 1" w:uiPriority="61"/>
+    <w:lsdException w:name="Light Grid Accent 1" w:uiPriority="62"/>
+    <w:lsdException w:name="Medium Shading 1 Accent 1" w:uiPriority="63"/>
+    <w:lsdException w:name="Medium Shading 2 Accent 1" w:uiPriority="64"/>
+    <w:lsdException w:name="Medium List 1 Accent 1" w:uiPriority="65"/>
+    <w:lsdException w:name="Revision" w:semiHidden="1"/>
+    <w:lsdException w:name="List Paragraph" w:uiPriority="34" w:qFormat="1"/>
+    <w:lsdException w:name="Quote" w:uiPriority="29" w:qFormat="1"/>
+    <w:lsdException w:name="Intense Quote" w:uiPriority="30" w:qFormat="1"/>
+    <w:lsdException w:name="Medium List 2 Accent 1" w:uiPriority="66"/>
+    <w:lsdException w:name="Medium Grid 1 Accent 1" w:uiPriority="67"/>
+    <w:lsdException w:name="Medium Grid 2 Accent 1" w:uiPriority="68"/>
+    <w:lsdException w:name="Medium Grid 3 Accent 1" w:uiPriority="69"/>
+    <w:lsdException w:name="Dark List Accent 1" w:uiPriority="70"/>
+    <w:lsdException w:name="Colorful Shading Accent 1" w:uiPriority="71"/>
+    <w:lsdException w:name="Colorful List Accent 1" w:uiPriority="72"/>
+    <w:lsdException w:name="Colorful Grid Accent 1" w:uiPriority="73"/>
+    <w:lsdException w:name="Light Shading Accent 2" w:uiPriority="60"/>
+    <w:lsdException w:name="Light List Accent 2" w:uiPriority="61"/>
+    <w:lsdException w:name="Light Grid Accent 2" w:uiPriority="62"/>
+    <w:lsdException w:name="Medium Shading 1 Accent 2" w:uiPriority="63"/>
+    <w:lsdException w:name="Medium Shading 2 Accent 2" w:uiPriority="64"/>
+    <w:lsdException w:name="Medium List 1 Accent 2" w:uiPriority="65"/>
+    <w:lsdException w:name="Medium List 2 Accent 2" w:uiPriority="66"/>
+    <w:lsdException w:name="Medium Grid 1 Accent 2" w:uiPriority="67"/>
+    <w:lsdException w:name="Medium Grid 2 Accent 2" w:uiPriority="68"/>
+    <w:lsdException w:name="Medium Grid 3 Accent 2" w:uiPriority="69"/>
+    <w:lsdException w:name="Dark List Accent 2" w:uiPriority="70"/>
+    <w:lsdException w:name="Colorful Shading Accent 2" w:uiPriority="71"/>
+    <w:lsdException w:name="Colorful List Accent 2" w:uiPriority="72"/>
+    <w:lsdException w:name="Colorful Grid Accent 2" w:uiPriority="73"/>
+    <w:lsdException w:name="Light Shading Accent 3" w:uiPriority="60"/>
+    <w:lsdException w:name="Light List Accent 3" w:uiPriority="61"/>
+    <w:lsdException w:name="Light Grid Accent 3" w:uiPriority="62"/>
+    <w:lsdException w:name="Medium Shading 1 Accent 3" w:uiPriority="63"/>
+    <w:lsdException w:name="Medium Shading 2 Accent 3" w:uiPriority="64"/>
+    <w:lsdException w:name="Medium List 1 Accent 3" w:uiPriority="65"/>
+    <w:lsdException w:name="Medium List 2 Accent 3" w:uiPriority="66"/>
+    <w:lsdException w:name="Medium Grid 1 Accent 3" w:uiPriority="67"/>
+    <w:lsdException w:name="Medium Grid 2 Accent 3" w:uiPriority="68"/>
+    <w:lsdException w:name="Medium Grid 3 Accent 3" w:uiPriority="69"/>
+    <w:lsdException w:name="Dark List Accent 3" w:uiPriority="70"/>
+    <w:lsdException w:name="Colorful Shading Accent 3" w:uiPriority="71"/>
+    <w:lsdException w:name="Colorful List Accent 3" w:uiPriority="72"/>
+    <w:lsdException w:name="Colorful Grid Accent 3" w:uiPriority="73"/>
+    <w:lsdException w:name="Light Shading Accent 4" w:uiPriority="60"/>
+    <w:lsdException w:name="Light List Accent 4" w:uiPriority="61"/>
+    <w:lsdException w:name="Light Grid Accent 4" w:uiPriority="62"/>
+    <w:lsdException w:name="Medium Shading 1 Accent 4" w:uiPriority="63"/>
+    <w:lsdException w:name="Medium Shading 2 Accent 4" w:uiPriority="64"/>
+    <w:lsdException w:name="Medium List 1 Accent 4" w:uiPriority="65"/>
+    <w:lsdException w:name="Medium List 2 Accent 4" w:uiPriority="66"/>
+    <w:lsdException w:name="Medium Grid 1 Accent 4" w:uiPriority="67"/>
+    <w:lsdException w:name="Medium Grid 2 Accent 4" w:uiPriority="68"/>
+    <w:lsdException w:name="Medium Grid 3 Accent 4" w:uiPriority="69"/>
+    <w:lsdException w:name="Dark List Accent 4" w:uiPriority="70"/>
+    <w:lsdException w:name="Colorful Shading Accent 4" w:uiPriority="71"/>
+    <w:lsdException w:name="Colorful List Accent 4" w:uiPriority="72"/>
+    <w:lsdException w:name="Colorful Grid Accent 4" w:uiPriority="73"/>
+    <w:lsdException w:name="Light Shading Accent 5" w:uiPriority="60"/>
+    <w:lsdException w:name="Light List Accent 5" w:uiPriority="61"/>
+    <w:lsdException w:name="Light Grid Accent 5" w:uiPriority="62"/>
+    <w:lsdException w:name="Medium Shading 1 Accent 5" w:uiPriority="63"/>
+    <w:lsdException w:name="Medium Shading 2 Accent 5" w:uiPriority="64"/>
+    <w:lsdException w:name="Medium List 1 Accent 5" w:uiPriority="65"/>
+    <w:lsdException w:name="Medium List 2 Accent 5" w:uiPriority="66"/>
+    <w:lsdException w:name="Medium Grid 1 Accent 5" w:uiPriority="67"/>
+    <w:lsdException w:name="Medium Grid 2 Accent 5" w:uiPriority="68"/>
+    <w:lsdException w:name="Medium Grid 3 Accent 5" w:uiPriority="69"/>
+    <w:lsdException w:name="Dark List Accent 5" w:uiPriority="70"/>
+    <w:lsdException w:name="Colorful Shading Accent 5" w:uiPriority="71"/>
+    <w:lsdException w:name="Colorful List Accent 5" w:uiPriority="72"/>
+    <w:lsdException w:name="Colorful Grid Accent 5" w:uiPriority="73"/>
+    <w:lsdException w:name="Light Shading Accent 6" w:uiPriority="60"/>
+    <w:lsdException w:name="Light List Accent 6" w:uiPriority="61"/>
+    <w:lsdException w:name="Light Grid Accent 6" w:uiPriority="62"/>
+    <w:lsdException w:name="Medium Shading 1 Accent 6" w:uiPriority="63"/>
+    <w:lsdException w:name="Medium Shading 2 Accent 6" w:uiPriority="64"/>
+    <w:lsdException w:name="Medium List 1 Accent 6" w:uiPriority="65"/>
+    <w:lsdException w:name="Medium List 2 Accent 6" w:uiPriority="66"/>
+    <w:lsdException w:name="Medium Grid 1 Accent 6" w:uiPriority="67"/>
+    <w:lsdException w:name="Medium Grid 2 Accent 6" w:uiPriority="68"/>
+    <w:lsdException w:name="Medium Grid 3 Accent 6" w:uiPriority="69"/>
+    <w:lsdException w:name="Dark List Accent 6" w:uiPriority="70"/>
+    <w:lsdException w:name="Colorful Shading Accent 6" w:uiPriority="71"/>
+    <w:lsdException w:name="Colorful List Accent 6" w:uiPriority="72"/>
+    <w:lsdException w:name="Colorful Grid Accent 6" w:uiPriority="73"/>
+    <w:lsdException w:name="Subtle Emphasis" w:uiPriority="19" w:qFormat="1"/>
+    <w:lsdException w:name="Intense Emphasis" w:uiPriority="21" w:qFormat="1"/>
+    <w:lsdException w:name="Subtle Reference" w:uiPriority="31" w:qFormat="1"/>
+    <w:lsdException w:name="Intense Reference" w:uiPriority="32" w:qFormat="1"/>
+    <w:lsdException w:name="Book Title" w:uiPriority="33" w:qFormat="1"/>
+    <w:lsdException w:name="Bibliography" w:semiHidden="1" w:uiPriority="37" w:unhideWhenUsed="1"/>
+    <w:lsdException w:name="TOC Heading" w:semiHidden="1" w:uiPriority="39" w:unhideWhenUsed="1" w:qFormat="1"/>
+    <w:lsdException w:name="Plain Table 1" w:uiPriority="41"/>
+    <w:lsdException w:name="Plain Table 2" w:uiPriority="42"/>
+    <w:lsdException w:name="Plain Table 3" w:uiPriority="43"/>
+    <w:lsdException w:name="Plain Table 4" w:uiPriority="44"/>
+    <w:lsdException w:name="Plain Table 5" w:uiPriority="45"/>
+    <w:lsdException w:name="Grid Table Light" w:uiPriority="40"/>
+    <w:lsdException w:name="Grid Table 1 Light" w:uiPriority="46"/>
+    <w:lsdException w:name="Grid Table 2" w:uiPriority="47"/>
+    <w:lsdException w:name="Grid Table 3" w:uiPriority="48"/>
+    <w:lsdException w:name="Grid Table 4" w:uiPriority="49"/>
+    <w:lsdException w:name="Grid Table 5 Dark" w:uiPriority="50"/>
+    <w:lsdException w:name="Grid Table 6 Colorful" w:uiPriority="51"/>
+    <w:lsdException w:name="Grid Table 7 Colorful" w:uiPriority="52"/>
+    <w:lsdException w:name="Grid Table 1 Light Accent 1" w:uiPriority="46"/>
+    <w:lsdException w:name="Grid Table 2 Accent 1" w:uiPriority="47"/>
+    <w:lsdException w:name="Grid Table 3 Accent 1" w:uiPriority="48"/>
+    <w:lsdException w:name="Grid Table 4 Accent 1" w:uiPriority="49"/>
+    <w:lsdException w:name="Grid Table 5 Dark Accent 1" w:uiPriority="50"/>
+    <w:lsdException w:name="Grid Table 6 Colorful Accent 1" w:uiPriority="51"/>
+    <w:lsdException w:name="Grid Table 7 Colorful Accent 1" w:uiPriority="52"/>
+    <w:lsdException w:name="Grid Table 1 Light Accent 2" w:uiPriority="46"/>
+    <w:lsdException w:name="Grid Table 2 Accent 2" w:uiPriority="47"/>
+    <w:lsdException w:name="Grid Table 3 Accent 2" w:uiPriority="48"/>
+    <w:lsdException w:name="Grid Table 4 Accent 2" w:uiPriority="49"/>
+    <w:lsdException w:name="Grid Table 5 Dark Accent 2" w:uiPriority="50"/>
+    <w:lsdException w:name="Grid Table 6 Colorful Accent 2" w:uiPriority="51"/>
+    <w:lsdException w:name="Grid Table 7 Colorful Accent 2" w:uiPriority="52"/>
+    <w:lsdException w:name="Grid Table 1 Light Accent 3" w:uiPriority="46"/>
+    <w:lsdException w:name="Grid Table 2 Accent 3" w:uiPriority="47"/>
+    <w:lsdException w:name="Grid Table 3 Accent 3" w:uiPriority="48"/>
+    <w:lsdException w:name="Grid Table 4 Accent 3" w:uiPriority="49"/>
+    <w:lsdException w:name="Grid Table 5 Dark Accent 3" w:uiPriority="50"/>
+    <w:lsdException w:name="Grid Table 6 Colorful Accent 3" w:uiPriority="51"/>
+    <w:lsdException w:name="Grid Table 7 Colorful Accent 3" w:uiPriority="52"/>
+    <w:lsdException w:name="Grid Table 1 Light Accent 4" w:uiPriority="46"/>
+    <w:lsdException w:name="Grid Table 2 Accent 4" w:uiPriority="47"/>
+    <w:lsdException w:name="Grid Table 3 Accent 4" w:uiPriority="48"/>
+    <w:lsdException w:name="Grid Table 4 Accent 4" w:uiPriority="49"/>
+    <w:lsdException w:name="Grid Table 5 Dark Accent 4" w:uiPriority="50"/>
+    <w:lsdException w:name="Grid Table 6 Colorful Accent 4" w:uiPriority="51"/>
+    <w:lsdException w:name="Grid Table 7 Colorful Accent 4" w:uiPriority="52"/>
+    <w:lsdException w:name="Grid Table 1 Light Accent 5" w:uiPriority="46"/>
+    <w:lsdException w:name="Grid Table 2 Accent 5" w:uiPriority="47"/>
+    <w:lsdException w:name="Grid Table 3 Accent 5" w:uiPriority="48"/>
+    <w:lsdException w:name="Grid Table 4 Accent 5" w:uiPriority="49"/>
+    <w:lsdException w:name="Grid Table 5 Dark Accent 5" w:uiPriority="50"/>
+    <w:lsdException w:name="Grid Table 6 Colorful Accent 5" w:uiPriority="51"/>
+    <w:lsdException w:name="Grid Table 7 Colorful Accent 5" w:uiPriority="52"/>
+    <w:lsdException w:name="Grid Table 1 Light Accent 6" w:uiPriority="46"/>
+    <w:lsdException w:name="Grid Table 2 Accent 6" w:uiPriority="47"/>
+    <w:lsdException w:name="Grid Table 3 Accent 6" w:uiPriority="48"/>
+    <w:lsdException w:name="Grid Table 4 Accent 6" w:uiPriority="49"/>
+    <w:lsdException w:name="Grid Table 5 Dark Accent 6" w:uiPriority="50"/>
+    <w:lsdException w:name="Grid Table 6 Colorful Accent 6" w:uiPriority="51"/>
+    <w:lsdException w:name="Grid Table 7 Colorful Accent 6" w:uiPriority="52"/>
+    <w:lsdException w:name="List Table 1 Light" w:uiPriority="46"/>
+    <w:lsdException w:name="List Table 2" w:uiPriority="47"/>
+    <w:lsdException w:name="List Table 3" w:uiPriority="48"/>
+    <w:lsdException w:name="List Table 4" w:uiPriority="49"/>
+    <w:lsdException w:name="List Table 5 Dark" w:uiPriority="50"/>
+    <w:lsdException w:name="List Table 6 Colorful" w:uiPriority="51"/>
+    <w:lsdException w:name="List Table 7 Colorful" w:uiPriority="52"/>
+    <w:lsdException w:name="List Table 1 Light Accent 1" w:uiPriority="46"/>
+    <w:lsdException w:name="List Table 2 Accent 1" w:uiPriority="47"/>
+    <w:lsdException w:name="List Table 3 Accent 1" w:uiPriority="48"/>
+    <w:lsdException w:name="List Table 4 Accent 1" w:uiPriority="49"/>
+    <w:lsdException w:name="List Table 5 Dark Accent 1" w:uiPriority="50"/>
+    <w:lsdException w:name="List Table 6 Colorful Accent 1" w:uiPriority="51"/>
+    <w:lsdException w:name="List Table 7 Colorful Accent 1" w:uiPriority="52"/>
+    <w:lsdException w:name="List Table 1 Light Accent 2" w:uiPriority="46"/>
+    <w:lsdException w:name="List Table 2 Accent 2" w:uiPriority="47"/>
+    <w:lsdException w:name="List Table 3 Accent 2" w:uiPriority="48"/>
+    <w:lsdException w:name="List Table 4 Accent 2" w:uiPriority="49"/>
+    <w:lsdException w:name="List Table 5 Dark Accent 2" w:uiPriority="50"/>
+    <w:lsdException w:name="List Table 6 Colorful Accent 2" w:uiPriority="51"/>
+    <w:lsdException w:name="List Table 7 Colorful Accent 2" w:uiPriority="52"/>
+    <w:lsdException w:name="List Table 1 Light Accent 3" w:uiPriority="46"/>
+    <w:lsdException w:name="List Table 2 Accent 3" w:uiPriority="47"/>
+    <w:lsdException w:name="List Table 3 Accent 3" w:uiPriority="48"/>
+    <w:lsdException w:name="List Table 4 Accent 3" w:uiPriority="49"/>
+    <w:lsdException w:name="List Table 5 Dark Accent 3" w:uiPriority="50"/>
+    <w:lsdException w:name="List Table 6 Colorful Accent 3" w:uiPriority="51"/>
+    <w:lsdException w:name="List Table 7 Colorful Accent 3" w:uiPriority="52"/>
+    <w:lsdException w:name="List Table 1 Light Accent 4" w:uiPriority="46"/>
+    <w:lsdException w:name="List Table 2 Accent 4" w:uiPriority="47"/>
+    <w:lsdException w:name="List Table 3 Accent 4" w:uiPriority="48"/>
+    <w:lsdException w:name="List Table 4 Accent 4" w:uiPriority="49"/>
+    <w:lsdException w:name="List Table 5 Dark Accent 4" w:uiPriority="50"/>
+    <w:lsdException w:name="List Table 6 Colorful Accent 4" w:uiPriority="51"/>
+    <w:lsdException w:name="List Table 7 Colorful Accent 4" w:uiPriority="52"/>
+    <w:lsdException w:name="List Table 1 Light Accent 5" w:uiPriority="46"/>
+    <w:lsdException w:name="List Table 2 Accent 5" w:uiPriority="47"/>
+    <w:lsdException w:name="List Table 3 Accent 5" w:uiPriority="48"/>
+    <w:lsdException w:name="List Table 4 Accent 5" w:uiPriority="49"/>
+    <w:lsdException w:name="List Table 5 Dark Accent 5" w:uiPriority="50"/>
+    <w:lsdException w:name="List Table 6 Colorful Accent 5" w:uiPriority="51"/>
+    <w:lsdException w:name="List Table 7 Colorful Accent 5" w:uiPriority="52"/>
+    <w:lsdException w:name="List Table 1 Light Accent 6" w:uiPriority="46"/>
+    <w:lsdException w:name="List Table 2 Accent 6" w:uiPriority="47"/>
+    <w:lsdException w:name="List Table 3 Accent 6" w:uiPriority="48"/>
+    <w:lsdException w:name="List Table 4 Accent 6" w:uiPriority="49"/>
+    <w:lsdException w:name="List Table 5 Dark Accent 6" w:uiPriority="50"/>
+    <w:lsdException w:name="List Table 6 Colorful Accent 6" w:uiPriority="51"/>
+    <w:lsdException w:name="List Table 7 Colorful Accent 6" w:uiPriority="52"/>
+    <w:lsdException w:name="Mention" w:semiHidden="1" w:unhideWhenUsed="1"/>
+    <w:lsdException w:name="Smart Hyperlink" w:semiHidden="1" w:unhideWhenUsed="1"/>
+    <w:lsdException w:name="Hashtag" w:semiHidden="1" w:unhideWhenUsed="1"/>
+    <w:lsdException w:name="Unresolved Mention" w:semiHidden="1" w:unhideWhenUsed="1"/>
+    <w:lsdException w:name="Smart Link" w:semiHidden="1" w:unhideWhenUsed="1"/>
+  </w:latentStyles>
+  <w:style w:type="paragraph" w:default="1" w:styleId="a">
     <w:name w:val="Normal"/>
+    <w:qFormat/>
   </w:style>
-  <w:style w:type="character" w:styleId="FootnoteReference">
-    <w:name w:val="Footnote Reference"/>
+  <w:style w:type="character" w:default="1" w:styleId="a0">
+    <w:name w:val="Default Paragraph Font"/>
+    <w:uiPriority w:val="1"/>
+    <w:semiHidden/>
+    <w:unhideWhenUsed/>
+  </w:style>
+  <w:style w:type="table" w:default="1" w:styleId="a1">
+    <w:name w:val="Normal Table"/>
+    <w:uiPriority w:val="99"/>
+    <w:semiHidden/>
+    <w:unhideWhenUsed/>
+    <w:tblPr>
+      <w:tblInd w:w="0" w:type="dxa"/>
+      <w:tblCellMar>
+        <w:top w:w="0" w:type="dxa"/>
+        <w:left w:w="108" w:type="dxa"/>
+        <w:bottom w:w="0" w:type="dxa"/>
+        <w:right w:w="108" w:type="dxa"/>
+      </w:tblCellMar>
+    </w:tblPr>
+  </w:style>
+  <w:style w:type="numbering" w:default="1" w:styleId="a2">
+    <w:name w:val="No List"/>
+    <w:uiPriority w:val="99"/>
+    <w:semiHidden/>
+    <w:unhideWhenUsed/>
+  </w:style>
+  <w:style w:type="character" w:styleId="a3">
+    <w:name w:val="footnote reference"/>
     <w:semiHidden/>
     <w:unhideWhenUsed/>
     <w:rPr>
       <w:vertAlign w:val="superscript"/>
     </w:rPr>
+  </w:style>
+  <w:style w:type="paragraph" w:styleId="a4">
+    <w:name w:val="header"/>
+    <w:basedOn w:val="a"/>
+    <w:link w:val="a5"/>
+    <w:uiPriority w:val="99"/>
+    <w:unhideWhenUsed/>
+    <w:rsid w:val="002733AE"/>
+    <w:pPr>
+      <w:tabs>
+        <w:tab w:val="center" w:pos="4153"/>
+        <w:tab w:val="right" w:pos="8306"/>
+      </w:tabs>
+      <w:spacing w:after="0" w:line="240" w:lineRule="auto"/>
+    </w:pPr>
+  </w:style>
+  <w:style w:type="character" w:customStyle="1" w:styleId="a5">
+    <w:name w:val="כותרת עליונה תו"/>
+    <w:basedOn w:val="a0"/>
+    <w:link w:val="a4"/>
+    <w:uiPriority w:val="99"/>
+    <w:rsid w:val="002733AE"/>
+  </w:style>
+  <w:style w:type="paragraph" w:styleId="a6">
+    <w:name w:val="footer"/>
+    <w:basedOn w:val="a"/>
+    <w:link w:val="a7"/>
+    <w:uiPriority w:val="99"/>
+    <w:unhideWhenUsed/>
+    <w:rsid w:val="002733AE"/>
+    <w:pPr>
+      <w:tabs>
+        <w:tab w:val="center" w:pos="4153"/>
+        <w:tab w:val="right" w:pos="8306"/>
+      </w:tabs>
+      <w:spacing w:after="0" w:line="240" w:lineRule="auto"/>
+    </w:pPr>
+  </w:style>
+  <w:style w:type="character" w:customStyle="1" w:styleId="a7">
+    <w:name w:val="כותרת תחתונה תו"/>
+    <w:basedOn w:val="a0"/>
+    <w:link w:val="a6"/>
+    <w:uiPriority w:val="99"/>
+    <w:rsid w:val="002733AE"/>
   </w:style>
 </w:styles>
 </file>

</xml_diff>